<commit_message>
Halve list indents (#11)
* .

* .

* Update Directory.Build.props
</commit_message>
<xml_diff>
--- a/src/Parchment.Tests/Docx/StringListTests.FilterOnStringListFallsThroughToFluid.verified.docx
+++ b/src/Parchment.Tests/Docx/StringListTests.FilterOnStringListFallsThroughToFluid.verified.docx
@@ -69,7 +69,7 @@
       <p2:lvlText p2:val="%1."/>
       <p2:lvlJc p2:val="left"/>
       <p2:pPr>
-        <p2:ind p2:left="720" p2:hanging="360"/>
+        <p2:ind p2:left="480" p2:hanging="240"/>
       </p2:pPr>
     </p2:lvl>
     <p2:lvl p2:ilvl="1">
@@ -78,7 +78,7 @@
       <p2:lvlText p2:val="%2."/>
       <p2:lvlJc p2:val="left"/>
       <p2:pPr>
-        <p2:ind p2:left="1080" p2:hanging="360"/>
+        <p2:ind p2:left="960" p2:hanging="240"/>
       </p2:pPr>
     </p2:lvl>
     <p2:lvl p2:ilvl="2">
@@ -87,7 +87,7 @@
       <p2:lvlText p2:val="%3."/>
       <p2:lvlJc p2:val="left"/>
       <p2:pPr>
-        <p2:ind p2:left="1440" p2:hanging="360"/>
+        <p2:ind p2:left="1440" p2:hanging="240"/>
       </p2:pPr>
     </p2:lvl>
   </abstractNum>

</xml_diff>